<commit_message>
Corrige Roky -> Rocky (Project Hail Mary) en las ediciones en castellano
- Fuentes de texto: content/lecturas, camara/, edicion_tapadura (ref. es).
- Ensayo: PDF y EPUB regenerados con sus scripts; mismas 792 páginas,
  solo cambian las seis páginas afectadas.
- Edición de cámara KDP (PDF maquetado y EPUB), edicion_camara y camara/:
  EPUB/DOCX corregidos en el XML; en los PDF sin script de regeneración
  se recompone cada línea afectada justificada entre sus márgenes
  originales, con la misma fuente, cuerpo y línea base.
- Se deja intacto edicion_camara/fuentes/ (documento de origen).

Co-Authored-By: Claude Opus 5.5 <noreply@anthropic.com>
Claude-Session: https://claude.ai/code/session_01QrzyiEuvpvkRytMfNspHre
</commit_message>
<xml_diff>
--- a/edicion_camara/El_Horizonte_Interior_Edicion_de_Camara.docx
+++ b/edicion_camara/El_Horizonte_Interior_Edicion_de_Camara.docx
@@ -3975,7 +3975,7 @@
         <w:pStyle w:val="FirstParagraph"/>
       </w:pPr>
       <w:r>
-        <w:t xml:space="preserve">Ryland Grace y Roky no comparten una sola palabra ni una sola arquitectura sensorial: Roky es ciego en el sentido humano, «ve» por eco de sonido, respira metano corrosivo tras un cristal que ninguno de los dos puede cruzar. Si el modelo de</w:t>
+        <w:t xml:space="preserve">Ryland Grace y Rocky no comparten una sola palabra ni una sola arquitectura sensorial: Rocky es ciego en el sentido humano, «ve» por eco de sonido, respira metano corrosivo tras un cristal que ninguno de los dos puede cruzar. Si el modelo de</w:t>
       </w:r>
       <w:r>
         <w:t xml:space="preserve"> </w:t>
@@ -3993,7 +3993,7 @@
         <w:t xml:space="preserve"> </w:t>
       </w:r>
       <w:r>
-        <w:t xml:space="preserve">fuera la última palabra, el entrelazamiento entre ambos sería, con toda certeza, imposible: no hay arquitectura compartida con la que resonar. Y sin embargo la novela documenta, paso a paso, cómo se construye igual —no encontrando un protocolo ya compatible, sino inventando uno nuevo desde el referente más neutro posible: las matemáticas y la física, comunes a cualquier horizonte capaz de sobrevivir en un universo con las mismas leyes. Cada palabra nueva —amigo, peligro, presión— se ancla primero a un experimento compartido, nunca a una traducción supuesta. El protocolo tarda semanas en construirse; el entrelazamiento, cuando llega, no es menor por haber sido fabricado en vez de hallado. Al final, Grace sacrifica su regreso a la Tierra para salvar el sol de Roky, no porque comparta su arquitectura, sino porque el protocolo que construyeron juntos terminó por abrir, letra a letra, un puente tan real como cualquier entrelazamiento nacido de una arquitectura ya afín. La incompatibilidad arquitectónica no cierra la puerta: solo obliga a que el protocolo se construya, en vez de encontrarse ya hecho.</w:t>
+        <w:t xml:space="preserve">fuera la última palabra, el entrelazamiento entre ambos sería, con toda certeza, imposible: no hay arquitectura compartida con la que resonar. Y sin embargo la novela documenta, paso a paso, cómo se construye igual —no encontrando un protocolo ya compatible, sino inventando uno nuevo desde el referente más neutro posible: las matemáticas y la física, comunes a cualquier horizonte capaz de sobrevivir en un universo con las mismas leyes. Cada palabra nueva —amigo, peligro, presión— se ancla primero a un experimento compartido, nunca a una traducción supuesta. El protocolo tarda semanas en construirse; el entrelazamiento, cuando llega, no es menor por haber sido fabricado en vez de hallado. Al final, Grace sacrifica su regreso a la Tierra para salvar el sol de Rocky, no porque comparta su arquitectura, sino porque el protocolo que construyeron juntos terminó por abrir, letra a letra, un puente tan real como cualquier entrelazamiento nacido de una arquitectura ya afín. La incompatibilidad arquitectónica no cierra la puerta: solo obliga a que el protocolo se construya, en vez de encontrarse ya hecho.</w:t>
       </w:r>
     </w:p>
     <w:bookmarkEnd w:id="67"/>

</xml_diff>